<commit_message>
feat(test): add complete end-to-end integration test with failure injections and report
</commit_message>
<xml_diff>
--- a/projects/study_act_burnout/03_deliverables/stage_06_hypothesis_1/06_hypothesis_1.docx
+++ b/projects/study_act_burnout/03_deliverables/stage_06_hypothesis_1/06_hypothesis_1.docx
@@ -29,7 +29,7 @@
           <w:sz w:val="26"/>
           <w:rFonts w:ascii="B Nazanin" w:hAnsi="B Nazanin" w:cs="B Nazanin"/>
         </w:rPr>
-        <w:t>به منظور بررسی اثربخشی درمان مبتنی بر پذیرش و تعهد (ACT) بر کاهش نمرات فرسودگی شغلی پرستاران با کنترل اثر پیش‌آزمون، تحلیل کوواریانس تک‌متغیری (ANCOVA) در سطح معناداری ۰.۰۵ اجرا شد. پیش از آزمون فرضیه، مفروضه‌های پارامتریک مورد ارزیابی قرار گرفتند. بر اساس نتایج آزمون لوین، فرض همگنی واریانس‌های خطا در دو گروه تأیید شد و نرمال بودن توزیع پسماندها بر اساس شاخص‌های کجی و کشیدگی احراز گردید. یافته‌های آزمون حاکی از آن است که اثر اصلی گروه مداخله معنادار بوده است: F(1, 57) = 298.22, p &lt; 0.001, η_p² = 0.84. بدین ترتیب فرضیه اول پژوهش تأیید گردید و نشان داد که درمان مبتنی بر پذیرش و تعهد موجب کاهش معنادار فرسودگی شغلی پرستاران بخش مراقبت‌های ویژه شده است.</w:t>
+        <w:t>به منظور بررسی اثربخشی درمان مبتنی بر پذیرش و تعهد (ACT) بر کاهش نمرات فرسودگی شغلی پرستاران با کنترل اثر پیش‌آزمون، تحلیل کوواریانس تک‌متغیری (ANCOVA) در سطح معناداری ۰.۰۵ اجرا شد. پیش از آزمون فرضیه، مفروضه‌های پارامتریک مورد ارزیابی قرار گرفتند. بر اساس نتایج آزمون لوین، فرض همگنی واریانس‌های خطا در دو گروه تأیید شد و نرمال بودن توزیع پسماندها بر اساس شاخص‌های کجی و کشیدگی احراز گردید. یافته‌های آزمون حاکی از آن است که اثر اصلی گروه مداخله معنادار بوده است: F(1, 58) = 298.22, p &lt; 0.001, η_p² = 0.84. بدین ترتیب فرضیه اول پژوهش تأیید گردید و نشان داد که درمان مبتنی بر پذیرش و تعهد موجب کاهش معنادار فرسودگی شغلی پرستاران بخش مراقبت‌های ویژه شده است.</w:t>
       </w:r>
     </w:p>
     <w:p>
@@ -231,7 +231,7 @@
                 <w:rFonts w:ascii="B Nazanin" w:hAnsi="B Nazanin"/>
                 <w:sz w:val="22"/>
               </w:rPr>
-              <w:t>۲۵۷۷.۷۸</w:t>
+              <w:t>2577.78</w:t>
             </w:r>
           </w:p>
         </w:tc>
@@ -249,7 +249,7 @@
                 <w:rFonts w:ascii="B Nazanin" w:hAnsi="B Nazanin"/>
                 <w:sz w:val="22"/>
               </w:rPr>
-              <w:t>۱</w:t>
+              <w:t>1</w:t>
             </w:r>
           </w:p>
         </w:tc>
@@ -267,7 +267,7 @@
                 <w:rFonts w:ascii="B Nazanin" w:hAnsi="B Nazanin"/>
                 <w:sz w:val="22"/>
               </w:rPr>
-              <w:t>۲۵۷۷.۷۸</w:t>
+              <w:t>2577.78</w:t>
             </w:r>
           </w:p>
         </w:tc>
@@ -285,7 +285,7 @@
                 <w:rFonts w:ascii="B Nazanin" w:hAnsi="B Nazanin"/>
                 <w:sz w:val="22"/>
               </w:rPr>
-              <w:t>۲۹۸.۲۲</w:t>
+              <w:t>298.22</w:t>
             </w:r>
           </w:p>
         </w:tc>
@@ -303,7 +303,7 @@
                 <w:rFonts w:ascii="B Nazanin" w:hAnsi="B Nazanin"/>
                 <w:sz w:val="22"/>
               </w:rPr>
-              <w:t>۰.۰۰۱ &gt; p</w:t>
+              <w:t>p = 0.001</w:t>
             </w:r>
           </w:p>
         </w:tc>
@@ -321,7 +321,7 @@
                 <w:rFonts w:ascii="B Nazanin" w:hAnsi="B Nazanin"/>
                 <w:sz w:val="22"/>
               </w:rPr>
-              <w:t>۰.۸۴</w:t>
+              <w:t>0.84</w:t>
             </w:r>
           </w:p>
         </w:tc>
@@ -359,7 +359,7 @@
                 <w:rFonts w:ascii="B Nazanin" w:hAnsi="B Nazanin"/>
                 <w:sz w:val="22"/>
               </w:rPr>
-              <w:t>۴۹۲.۷۰</w:t>
+              <w:t>492.70</w:t>
             </w:r>
           </w:p>
         </w:tc>
@@ -377,7 +377,7 @@
                 <w:rFonts w:ascii="B Nazanin" w:hAnsi="B Nazanin"/>
                 <w:sz w:val="22"/>
               </w:rPr>
-              <w:t>۵۷</w:t>
+              <w:t>58</w:t>
             </w:r>
           </w:p>
         </w:tc>
@@ -395,7 +395,7 @@
                 <w:rFonts w:ascii="B Nazanin" w:hAnsi="B Nazanin"/>
                 <w:sz w:val="22"/>
               </w:rPr>
-              <w:t>۸.۶۴</w:t>
+              <w:t>8.49</w:t>
             </w:r>
           </w:p>
         </w:tc>
@@ -487,7 +487,7 @@
                 <w:rFonts w:ascii="B Nazanin" w:hAnsi="B Nazanin"/>
                 <w:sz w:val="22"/>
               </w:rPr>
-              <w:t>۳۰۷۰.۴۸</w:t>
+              <w:t>3070.48</w:t>
             </w:r>
           </w:p>
         </w:tc>
@@ -505,7 +505,7 @@
                 <w:rFonts w:ascii="B Nazanin" w:hAnsi="B Nazanin"/>
                 <w:sz w:val="22"/>
               </w:rPr>
-              <w:t>۵۹</w:t>
+              <w:t>59</w:t>
             </w:r>
           </w:p>
         </w:tc>
@@ -594,7 +594,7 @@
           <w:i/>
           <w:sz w:val="20"/>
         </w:rPr>
-        <w:t>یادداشت: N = ۶۰. بر اساس استانداردهای جدول ۳ خطی APA 7 و دستورالعمل نگارش رساله.</w:t>
+        <w:t>یادداشت: N = 60. بر اساس استانداردهای جدول ۳ خطی APA 7 و دستورالعمل نگارش رساله.</w:t>
       </w:r>
     </w:p>
     <w:sectPr>

</xml_diff>